<commit_message>
Fix cross-section inconsistencies in spec v0.3
- Beta excludes pre-authorized auto-execution (ASG-16 moves to GA); SCH-06
  moves to Home; first-party connectors carry full CON-12 manifests
- CON-12 manifest lists every per-connector declaration other requirements
  rely on (token lifetime, resource parameters, duplicate-prevention and
  recovery class, replay window, cost model)
- Invariant 4 and its guardrail cover every billable operation
- SUP-06 samples triage inputs that never became queue items
- Align stale terms with run states (SUP-03, RUN-04), capability grants
  (CON-03, threat table) and step-scoped tokens; PAY-06 follows RUN-07
- Red-team before the beta (gate 0) as well as before GA
- Roadmap diagram matches the requirement matrix and exit gates
- Refresh the Markdown, docx and phasing image

Co-Authored-By: Claude Opus 5.5 <noreply@anthropic.com>
</commit_message>
<xml_diff>
--- a/docs/Collicity — Product Specification (Draft v0.3).docx
+++ b/docs/Collicity — Product Specification (Draft v0.3).docx
@@ -272,10 +272,10 @@
         <w:rPr>
           <w:b/>
         </w:rPr>
-        <w:t xml:space="preserve">No AI-cost call without reserved budget.</w:t>
-      </w:r>
-      <w:r>
-        <w:t xml:space="preserve"> No model or paid API call starts until its worst-case cost is reserved against the budget (BUD-03).</w:t>
+        <w:t xml:space="preserve">No billable operation without reserved budget.</w:t>
+      </w:r>
+      <w:r>
+        <w:t xml:space="preserve"> No model call, paid API call, compute or fee starts until its worst-case cost is reserved against every applicable budget (BUD-03, BUD-10).</w:t>
       </w:r>
     </w:p>
     <w:p>
@@ -1353,7 +1353,7 @@
           <w:p>
             <w:pPr/>
             <w:r>
-              <w:t xml:space="preserve">Name; description (user- or AI-written); input/output schema; allowed connectors and actions; model or "Auto"; success criteria; approval gate; timeout; retry policy</w:t>
+              <w:t xml:space="preserve">Name; description (user- or AI-written); input/output schema; capability grants (CON-02); model or "Auto"; success criteria; approval gate; timeout; retry policy</w:t>
             </w:r>
           </w:p>
         </w:tc>
@@ -1703,7 +1703,7 @@
           <w:p>
             <w:pPr/>
             <w:r>
-              <w:t xml:space="preserve">Success and defect rates, cost per successful task, latency, sample size</w:t>
+              <w:t xml:space="preserve">Verified-success rate (INV-06), evidence by class, cost per verified success, latency, sample size</w:t>
             </w:r>
           </w:p>
         </w:tc>
@@ -2612,7 +2612,7 @@
           <w:p>
             <w:pPr/>
             <w:r>
-              <w:t xml:space="preserve">Highest risk; only if approved in §14</w:t>
+              <w:t xml:space="preserve">Highest risk; only if approved (§21)</w:t>
             </w:r>
           </w:p>
         </w:tc>
@@ -2737,7 +2737,7 @@
         <w:t xml:space="preserve">CON-03 (P0) No escalation attempts.</w:t>
       </w:r>
       <w:r>
-        <w:t xml:space="preserve"> The gateway blocks any action outside the task's declared set and never requests scopes beyond the connector manifest. A denied call (401/403) ends the step; it is never retried with other credentials, scopes or methods. Repeated out-of-policy attempts auto-suspend the task and raise a security event.</w:t>
+        <w:t xml:space="preserve"> The gateway blocks any call outside the task's capability grants (CON-02) and never requests scopes beyond the connector manifest. A denied call (401/403) ends the step; it is never retried with other credentials, scopes or methods. Repeated out-of-policy attempts auto-suspend the task and raise a security event.</w:t>
       </w:r>
     </w:p>
     <w:p>
@@ -3216,7 +3216,7 @@
         <w:t xml:space="preserve">CON-12 (P0)</w:t>
       </w:r>
       <w:r>
-        <w:t xml:space="preserve"> Connector SDK (TypeScript and Python) that produces an MCP server with a signed manifest: auth method, scopes, actions (each classed read / write / destructive), data classes, rate limits.</w:t>
+        <w:t xml:space="preserve"> Connector SDK (TypeScript and Python) that produces an MCP server with a signed manifest: auth method, token lifetime (CON-04), scopes, actions (each classed read / write / destructive), the parameters that identify resources and recipients (CON-02), each write's duplicate-prevention and recovery class (RUN-06, RUN-07), event replay window (RUN-02), cost model (BUD-03), data classes and rate limits. First-party connectors ship the same manifest.</w:t>
       </w:r>
     </w:p>
     <w:p>
@@ -3310,7 +3310,7 @@
         <w:pStyle w:val="Heading3"/>
       </w:pPr>
       <w:r>
-        <w:t xml:space="preserve">7.1 Your three examples as assignments</w:t>
+        <w:t xml:space="preserve">7.1 Example assignments</w:t>
       </w:r>
     </w:p>
     <w:tbl>
@@ -3913,7 +3913,7 @@
         <w:t xml:space="preserve">RUN-04 (P0) Credentials after waits.</w:t>
       </w:r>
       <w:r>
-        <w:t xml:space="preserve"> Runs never hold credentials across a wait. Each step obtains a fresh delegated token from the user's current grant at execution time; if the grant was revoked, expired or needs step-up authentication, the run pauses as "needs re-authorization" and notifies the owner. Approvals bind to the exact action and parameters they showed, and expire after 7 days by default. Each approval request also records the version of the item it was based on; if the item changed before the decision, the request goes stale and is re-presented with current and proposed values side by side, so it never overwrites a newer decision. Request states: pending, blocked (e.g., the proposed assignee can't see the sources), invalid (failed a deterministic check; kept for forensics), accepted, rejected, stale.</w:t>
+        <w:t xml:space="preserve"> Runs never hold credentials across a wait. Each step obtains a fresh delegated token from the user's current grant at execution time; if the grant was revoked, expired or needs step-up authentication, the run moves to Paused: re-authorization (§7.6) and notifies the owner. Approvals bind to the exact action and parameters they showed, and expire after 7 days by default. Each approval request also records the version of the item it was based on; if the item changed before the decision, the request goes stale and is re-presented with current and proposed values side by side, so it never overwrites a newer decision. Request states: pending, blocked (e.g., the proposed assignee can't see the sources), invalid (failed a deterministic check; kept for forensics), accepted, rejected, stale.</w:t>
       </w:r>
     </w:p>
     <w:p>
@@ -4920,7 +4920,7 @@
     <w:p>
       <w:pPr/>
       <w:r>
-        <w:t xml:space="preserve">Every assignment has a hard AI budget that cannot be exceeded without the owner's explicit authorization. The guarantee comes from reserving each call's worst-case cost before it is made, not from after-the-fact accounting.</w:t>
+        <w:t xml:space="preserve">Every assignment has a hard AI budget that cannot be exceeded without the owner's explicit authorization. The guarantee comes from reserving each billable operation's worst-case cost before it starts, not from after-the-fact accounting.</w:t>
       </w:r>
     </w:p>
     <w:p>
@@ -5243,7 +5243,7 @@
         <w:t xml:space="preserve">RTR-04 (P0) Explainable choices.</w:t>
       </w:r>
       <w:r>
-        <w:t xml:space="preserve"> Each decision records candidates, scores and a plain-language reason ("Chose model A: 96% success on extraction at $0.004 per run; model B: 97% at $0.03").</w:t>
+        <w:t xml:space="preserve"> Each decision records candidates, scores and a plain-language reason ("Chose model A: lower bound 94% on extraction at $0.004 per attempt; model B: 95% at $0.03").</w:t>
       </w:r>
     </w:p>
     <w:p>
@@ -5673,7 +5673,7 @@
         <w:t xml:space="preserve">SUP-03 (P0) Interventions, in escalating order:</w:t>
       </w:r>
       <w:r>
-        <w:t xml:space="preserve"> annotate (flag to the user) → recommend (model, prompt or task change) → retry with feedback → take over (re-run the step on a stronger model) → halt and ask a human. All interventions spend from the same assignment budget and appear on the run timeline.</w:t>
+        <w:t xml:space="preserve"> annotate (flag to the user) → recommend (model, prompt or task change) → retry with feedback → take over (re-run the step on a stronger model) → pause and ask a human (§7.6). All interventions spend from the same assignment budget and appear on the run timeline.</w:t>
       </w:r>
     </w:p>
     <w:p>
@@ -5727,7 +5727,7 @@
         <w:t xml:space="preserve">SUP-06 (P0) Independent evaluation set.</w:t>
       </w:r>
       <w:r>
-        <w:t xml:space="preserve"> A random sample of runs, stratified by task type and criticality, is adjudicated by reviewers who don't see the supervisor's verdict. It is the ground truth for escaped defects, supervisor precision and recall, and unnecessary interventions (§19). Reviewers must be entitled to the data: tenant-designated reviewers in Enterprise, opt-in only in Home.</w:t>
+        <w:t xml:space="preserve"> A random sample of runs, stratified by task type and criticality, is adjudicated by reviewers who don't see the supervisor's verdict. It is the ground truth for escaped defects, supervisor precision and recall, and unnecessary interventions (§19). For triage workflows the sample also draws from inputs that never became queue items, stratified by pipeline stage including pre-filter drops (archived AC-15). Reviewers must be entitled to the data: tenant-designated reviewers in Enterprise, opt-in only in Home.</w:t>
       </w:r>
     </w:p>
     <w:p>
@@ -7085,7 +7085,7 @@
         <w:t xml:space="preserve">PAY-06 (P0) At most one order per approval,</w:t>
       </w:r>
       <w:r>
-        <w:t xml:space="preserve"> enforced with idempotency keys and duplicate detection.</w:t>
+        <w:t xml:space="preserve"> enforced through the merchant's idempotency support or read-before-write duplicate detection (RUN-07); with neither, an uncertain outcome needs a fresh approval rather than a retry.</w:t>
       </w:r>
     </w:p>
     <w:p>
@@ -7151,7 +7151,7 @@
         <w:t xml:space="preserve">Feasibility risk.</w:t>
       </w:r>
       <w:r>
-        <w:t xml:space="preserve"> From what I know (approximate; verify before committing), public grocery and delivery APIs mostly stop at building a cart or shoppable list, with checkout finished in the merchant's own app. Fully autonomous checkout likely needs merchant partnerships, an agent-payment protocol, or browser automation. Fallback for launch: "cart ready — tap to pay".</w:t>
+        <w:t xml:space="preserve"> Unverified assumption, to check before committing: public grocery and delivery APIs mostly stop at building a cart or shoppable list, with checkout finished in the merchant's own app. Fully autonomous checkout likely needs merchant partnerships, an agent-payment protocol, or browser automation. Fallback for launch: "cart ready — tap to pay".</w:t>
       </w:r>
     </w:p>
     <w:p>
@@ -7251,7 +7251,7 @@
           <w:p>
             <w:pPr/>
             <w:r>
-              <w:t xml:space="preserve">Connector data treated as untrusted (CON-10); task action allowlist; approval on external sends; supervisor policy check</w:t>
+              <w:t xml:space="preserve">Connector data treated as untrusted (CON-10); capability grants (CON-02); approval on external sends; supervisor policy check</w:t>
             </w:r>
           </w:p>
         </w:tc>
@@ -7321,7 +7321,7 @@
           <w:p>
             <w:pPr/>
             <w:r>
-              <w:t xml:space="preserve">HSM-backed vault; DPoP / mTLS binding; short lifetimes; anomaly alerts</w:t>
+              <w:t xml:space="preserve">HSM-backed vault; tokens kept in the broker and released per step (CON-04); DPoP / mTLS binding; anomaly alerts</w:t>
             </w:r>
           </w:p>
         </w:tc>
@@ -7570,7 +7570,7 @@
         <w:t xml:space="preserve">SEC-02 (P0) Secure development.</w:t>
       </w:r>
       <w:r>
-        <w:t xml:space="preserve"> Threat model per feature; SAST, DAST and dependency scanning; SBOMs; signed builds for desktop and mobile; third-party penetration test and AI red-team exercise before GA; bug bounty after GA.</w:t>
+        <w:t xml:space="preserve"> Threat model per feature; SAST, DAST and dependency scanning; SBOMs; signed builds for desktop and mobile; AI red-team exercise before the beta (gate 0) and again before GA; third-party penetration test before GA; bug bounty after GA.</w:t>
       </w:r>
     </w:p>
     <w:p>
@@ -8818,7 +8818,7 @@
           <w:p>
             <w:pPr/>
             <w:r>
-              <w:t xml:space="preserve">CON-01–04, 06–10; CON-05 only if a partner needs it; Graph plus at most 2 partner connectors</w:t>
+              <w:t xml:space="preserve">CON-01–04, 06–10; CON-05 only if a partner needs it; Graph plus at most 2 partner connectors, each with a full CON-12 manifest</w:t>
             </w:r>
           </w:p>
         </w:tc>
@@ -8875,7 +8875,7 @@
           <w:p>
             <w:pPr/>
             <w:r>
-              <w:t xml:space="preserve">ASG-01, 02, 04–06, 09–16; RUN-01–07</w:t>
+              <w:t xml:space="preserve">ASG-01, 02, 04–06, 09–15, with every action approved (no pre-authorization before gate 1); RUN-01–07</w:t>
             </w:r>
           </w:p>
         </w:tc>
@@ -8886,7 +8886,7 @@
           <w:p>
             <w:pPr/>
             <w:r>
-              <w:t xml:space="preserve">ASG-03, 07, 08</w:t>
+              <w:t xml:space="preserve">ASG-03, 07, 08, 16</w:t>
             </w:r>
           </w:p>
         </w:tc>
@@ -9103,7 +9103,7 @@
           <w:p>
             <w:pPr/>
             <w:r>
-              <w:t xml:space="preserve">SCH-03 mail events; SCH-06</w:t>
+              <w:t xml:space="preserve">SCH-03 mail events</w:t>
             </w:r>
           </w:p>
         </w:tc>
@@ -9125,7 +9125,7 @@
           <w:p>
             <w:pPr/>
             <w:r>
-              <w:t xml:space="preserve">SCH-04, 05</w:t>
+              <w:t xml:space="preserve">SCH-04–06</w:t>
             </w:r>
           </w:p>
         </w:tc>
@@ -11315,7 +11315,7 @@
           <w:p>
             <w:pPr/>
             <w:r>
-              <w:t xml:space="preserve">AI-cost calls started without a reservation, or budget overruns without authorization (invariant 4)</w:t>
+              <w:t xml:space="preserve">Billable operations started without a reservation, or budget overruns without authorization (invariant 4)</w:t>
             </w:r>
           </w:p>
         </w:tc>
@@ -11532,7 +11532,7 @@
           <w:p>
             <w:pPr/>
             <w:r>
-              <w:t xml:space="preserve">§15 controls; approvals default on; red-team before GA</w:t>
+              <w:t xml:space="preserve">§15 controls; approvals default on; red-team before the beta and before GA</w:t>
             </w:r>
           </w:p>
         </w:tc>
@@ -11602,7 +11602,7 @@
           <w:p>
             <w:pPr/>
             <w:r>
-              <w:t xml:space="preserve">Personal credentials (CON-05); publish a per-connector attribution matrix</w:t>
+              <w:t xml:space="preserve">Personal credentials or live entitlement checks (CON-05); publish a per-connector attribution matrix</w:t>
             </w:r>
           </w:p>
         </w:tc>
@@ -11973,7 +11973,7 @@
         <w:t xml:space="preserve">docs/archive/</w:t>
       </w:r>
       <w:r>
-        <w:t xml:space="preserve"> in the collicity folder. Compliance is one customer vertical of Collicity; their sync semantics, measurement method and acceptance cases are reusable for any email- or chat-triggered workflow, starting with the beta.</w:t>
+        <w:t xml:space="preserve"> in the collicity repository. Compliance is one customer vertical of Collicity; their sync semantics, measurement method and acceptance cases are reusable for any email- or chat-triggered workflow, starting with the beta.</w:t>
       </w:r>
     </w:p>
     <w:p>
@@ -12833,7 +12833,7 @@
           <w:p>
             <w:pPr/>
             <w:r>
-              <w:t xml:space="preserve">Second review: capability grants and live entitlement checks (CON-02, CON-05); step-scoped grants vs. upstream token lifetime (CON-04); duplicate prevention and uncertain outcomes (RUN-07); run states (§7.6); reservations for every billable operation, atomic across levels, with increase authority (BUD-03, BUD-04, BUD-10); one prior policy, success label and attribution (RTR-07, INV-06, INV-07); published snapshots (SEC-10); requirement matrix, exit gates and beta contract (§18); missed-request metrics (§19)</w:t>
+              <w:t xml:space="preserve">Second review: capability grants and live entitlement checks (CON-02, CON-05); step-scoped grants vs. upstream token lifetime (CON-04); duplicate prevention and uncertain outcomes (RUN-07); run states (§7.6); reservations for every billable operation, atomic across levels, with increase authority (BUD-03, BUD-04, BUD-10); one prior policy, success label and attribution (RTR-07, INV-06, INV-07); published snapshots (SEC-10); requirement matrix, exit gates and beta contract (§18); missed-request metrics (§19); a consistency pass across sections</w:t>
             </w:r>
           </w:p>
         </w:tc>

</xml_diff>